<commit_message>
Add desync comments to both installs
</commit_message>
<xml_diff>
--- a/Doc/Project Apollo - NASSP/Programmers Notes/NASSP Quick Start Guide.docx
+++ b/Doc/Project Apollo - NASSP/Programmers Notes/NASSP Quick Start Guide.docx
@@ -50,7 +50,7 @@
           <w:b w:val="0"/>
           <w:bCs w:val="0"/>
         </w:rPr>
-        <w:t>0</w:t>
+        <w:t>1</w:t>
       </w:r>
     </w:p>
     <w:p>
@@ -68,15 +68,7 @@
           <w:b w:val="0"/>
           <w:bCs w:val="0"/>
         </w:rPr>
-        <w:t>2</w:t>
-      </w:r>
-      <w:r>
-        <w:rPr>
-          <w:rStyle w:val="IntenseReference"/>
-          <w:b w:val="0"/>
-          <w:bCs w:val="0"/>
-        </w:rPr>
-        <w:t>7</w:t>
+        <w:t>9</w:t>
       </w:r>
       <w:r>
         <w:rPr>
@@ -92,7 +84,7 @@
           <w:b w:val="0"/>
           <w:bCs w:val="0"/>
         </w:rPr>
-        <w:t>SEP</w:t>
+        <w:t>OCT</w:t>
       </w:r>
       <w:r>
         <w:rPr>
@@ -165,7 +157,7 @@
           <w:r>
             <w:fldChar w:fldCharType="separate"/>
           </w:r>
-          <w:hyperlink w:anchor="_Toc241405945" w:history="1">
+          <w:hyperlink w:anchor="_Toc242456622" w:history="1">
             <w:r>
               <w:rPr>
                 <w:rStyle w:val="Hyperlink"/>
@@ -192,7 +184,7 @@
                 <w:noProof/>
                 <w:webHidden/>
               </w:rPr>
-              <w:instrText xml:space="preserve"> PAGEREF _Toc241405945 \h </w:instrText>
+              <w:instrText xml:space="preserve"> PAGEREF _Toc242456622 \h </w:instrText>
             </w:r>
             <w:r>
               <w:rPr>
@@ -236,7 +228,7 @@
               <w:szCs w:val="24"/>
             </w:rPr>
           </w:pPr>
-          <w:hyperlink w:anchor="_Toc241405946" w:history="1">
+          <w:hyperlink w:anchor="_Toc242456623" w:history="1">
             <w:r>
               <w:rPr>
                 <w:rStyle w:val="Hyperlink"/>
@@ -263,7 +255,7 @@
                 <w:noProof/>
                 <w:webHidden/>
               </w:rPr>
-              <w:instrText xml:space="preserve"> PAGEREF _Toc241405946 \h </w:instrText>
+              <w:instrText xml:space="preserve"> PAGEREF _Toc242456623 \h </w:instrText>
             </w:r>
             <w:r>
               <w:rPr>
@@ -283,7 +275,7 @@
                 <w:noProof/>
                 <w:webHidden/>
               </w:rPr>
-              <w:t>5</w:t>
+              <w:t>6</w:t>
             </w:r>
             <w:r>
               <w:rPr>
@@ -307,7 +299,7 @@
               <w:szCs w:val="24"/>
             </w:rPr>
           </w:pPr>
-          <w:hyperlink w:anchor="_Toc241405947" w:history="1">
+          <w:hyperlink w:anchor="_Toc242456624" w:history="1">
             <w:r>
               <w:rPr>
                 <w:rStyle w:val="Hyperlink"/>
@@ -334,7 +326,7 @@
                 <w:noProof/>
                 <w:webHidden/>
               </w:rPr>
-              <w:instrText xml:space="preserve"> PAGEREF _Toc241405947 \h </w:instrText>
+              <w:instrText xml:space="preserve"> PAGEREF _Toc242456624 \h </w:instrText>
             </w:r>
             <w:r>
               <w:rPr>
@@ -354,7 +346,7 @@
                 <w:noProof/>
                 <w:webHidden/>
               </w:rPr>
-              <w:t>7</w:t>
+              <w:t>8</w:t>
             </w:r>
             <w:r>
               <w:rPr>
@@ -378,7 +370,7 @@
               <w:szCs w:val="24"/>
             </w:rPr>
           </w:pPr>
-          <w:hyperlink w:anchor="_Toc241405948" w:history="1">
+          <w:hyperlink w:anchor="_Toc242456625" w:history="1">
             <w:r>
               <w:rPr>
                 <w:rStyle w:val="Hyperlink"/>
@@ -405,7 +397,7 @@
                 <w:noProof/>
                 <w:webHidden/>
               </w:rPr>
-              <w:instrText xml:space="preserve"> PAGEREF _Toc241405948 \h </w:instrText>
+              <w:instrText xml:space="preserve"> PAGEREF _Toc242456625 \h </w:instrText>
             </w:r>
             <w:r>
               <w:rPr>
@@ -425,7 +417,7 @@
                 <w:noProof/>
                 <w:webHidden/>
               </w:rPr>
-              <w:t>13</w:t>
+              <w:t>14</w:t>
             </w:r>
             <w:r>
               <w:rPr>
@@ -449,7 +441,7 @@
               <w:szCs w:val="24"/>
             </w:rPr>
           </w:pPr>
-          <w:hyperlink w:anchor="_Toc241405949" w:history="1">
+          <w:hyperlink w:anchor="_Toc242456626" w:history="1">
             <w:r>
               <w:rPr>
                 <w:rStyle w:val="Hyperlink"/>
@@ -476,7 +468,7 @@
                 <w:noProof/>
                 <w:webHidden/>
               </w:rPr>
-              <w:instrText xml:space="preserve"> PAGEREF _Toc241405949 \h </w:instrText>
+              <w:instrText xml:space="preserve"> PAGEREF _Toc242456626 \h </w:instrText>
             </w:r>
             <w:r>
               <w:rPr>
@@ -496,7 +488,7 @@
                 <w:noProof/>
                 <w:webHidden/>
               </w:rPr>
-              <w:t>18</w:t>
+              <w:t>19</w:t>
             </w:r>
             <w:r>
               <w:rPr>
@@ -684,7 +676,7 @@
       <w:pPr>
         <w:pStyle w:val="Heading1"/>
       </w:pPr>
-      <w:bookmarkStart w:id="0" w:name="_Toc241405945"/>
+      <w:bookmarkStart w:id="0" w:name="_Toc242456622"/>
       <w:r>
         <w:lastRenderedPageBreak/>
         <w:t>Installation (NASSP 8</w:t>
@@ -763,7 +755,7 @@
         <w:t xml:space="preserve"> Beta R90 which includes a crucial fix to docked spacecraft physics which is not in the release version.</w:t>
       </w:r>
       <w:r>
-        <w:t xml:space="preserve"> NASSP 8.0 is also not compatible with Orbiter 2024 or Open Orbiter releases. NASSP 9.0 development will be released for those versions.</w:t>
+        <w:t xml:space="preserve"> NASSP 8.0 is also not compatible with Orbiter 2024 or Open Orbiter releases. NASSP 9.0 development will be released for those versions</w:t>
       </w:r>
       <w:r>
         <w:br/>
@@ -830,7 +822,7 @@
         </w:r>
       </w:hyperlink>
       <w:r>
-        <w:t> and extract the zip to your desired install folder.</w:t>
+        <w:t> and extract the zip to your desired install folder</w:t>
       </w:r>
       <w:r>
         <w:br/>
@@ -926,15 +918,7 @@
         <w:t xml:space="preserve">. </w:t>
       </w:r>
       <w:r>
-        <w:t xml:space="preserve">This contains only </w:t>
-      </w:r>
-      <w:proofErr w:type="gramStart"/>
-      <w:r>
-        <w:t>Low Res</w:t>
-      </w:r>
-      <w:proofErr w:type="gramEnd"/>
-      <w:r>
-        <w:t xml:space="preserve"> textures</w:t>
+        <w:t>This contains only Low Res textures</w:t>
       </w:r>
     </w:p>
     <w:p>
@@ -994,7 +978,7 @@
         <w:t xml:space="preserve"> </w:t>
       </w:r>
       <w:r>
-        <w:t>and copy to your Textures/Earth and Textures/Moon folders respectively.</w:t>
+        <w:t>and copy to your Textures/Earth and Textures/Moon folders respectively</w:t>
       </w:r>
     </w:p>
     <w:p>
@@ -1017,17 +1001,12 @@
         </w:r>
       </w:hyperlink>
       <w:r>
-        <w:t> Scroll down to "</w:t>
-      </w:r>
-      <w:proofErr w:type="spellStart"/>
-      <w:r>
-        <w:t>MicroTexture</w:t>
-      </w:r>
-      <w:proofErr w:type="spellEnd"/>
-      <w:r>
-        <w:t xml:space="preserve"> Pack for D3D9Client" and unzip to your Orbiter directory.</w:t>
-      </w:r>
-      <w:r>
+        <w:t> Scroll down to "MicroTexture Pack for D3D9Client" and unzip to your Orbiter directory</w:t>
+      </w:r>
+    </w:p>
+    <w:p>
+      <w:r>
+        <w:lastRenderedPageBreak/>
         <w:br/>
       </w:r>
       <w:r>
@@ -1038,15 +1017,7 @@
         <w:t>Optional:</w:t>
       </w:r>
       <w:r>
-        <w:t xml:space="preserve"> Download "Apollo Landing Sites for Orbiter 2016" by </w:t>
-      </w:r>
-      <w:proofErr w:type="spellStart"/>
-      <w:r>
-        <w:t>ggalfi</w:t>
-      </w:r>
-      <w:proofErr w:type="spellEnd"/>
-      <w:r>
-        <w:t xml:space="preserve"> here: </w:t>
+        <w:t> Download "Apollo Landing Sites for Orbiter 2016" by ggalfi here: </w:t>
       </w:r>
       <w:hyperlink r:id="rId15" w:tgtFrame="_blank" w:history="1">
         <w:r>
@@ -1057,15 +1028,13 @@
         </w:r>
       </w:hyperlink>
       <w:r>
-        <w:t xml:space="preserve"> and unzip to your Orbiter </w:t>
-      </w:r>
-      <w:r>
-        <w:lastRenderedPageBreak/>
-        <w:t>directory.</w:t>
-      </w:r>
+        <w:t> and unzip to your Orbiter directory</w:t>
+      </w:r>
+    </w:p>
+    <w:p>
       <w:r>
         <w:br/>
-        <w:t>The scenery is breathtaking but be aware there can sometimes be a mismatch between the visible terrain and the physical terrain in the Orbiter engine, so the LM can sometimes be floating above or sunken into the surface after landing. If you try and land exactly at the historical landing site, the mismatch should be minimal.</w:t>
+        <w:t>The scenery is breathtaking but be aware there can sometimes be a mismatch between the visible terrain and the physical terrain in the Orbiter engine, so the LM can sometimes be floating above or sunken into the surface after landing. If you try and land exactly at the historical landing site, the mismatch should be minimal</w:t>
       </w:r>
       <w:r>
         <w:br/>
@@ -1133,21 +1102,21 @@
         <w:t xml:space="preserve"> 2016</w:t>
       </w:r>
       <w:r>
-        <w:t xml:space="preserve"> Beta R90.</w:t>
+        <w:t xml:space="preserve"> Beta R90</w:t>
       </w:r>
       <w:r>
         <w:br/>
       </w:r>
       <w:r>
         <w:br/>
-        <w:t>- Download and unzip the client file to your Orbiter installation folder.</w:t>
+        <w:t>- Download and unzip the client file to your Orbiter installation folder</w:t>
       </w:r>
       <w:r>
         <w:br/>
       </w:r>
       <w:r>
         <w:br/>
-        <w:t>- Start Orbiter_ng.exe (NOT Orbiter.exe) from your Orbiter installation folder. Go to the "Modules" tab and activate the "D3D9Client" module. The "Video" tab appears, configure the video settings as you like, they are quite similar to the usual Orbiter video settings. It is recommended to use "Full Screen Window" mode.</w:t>
+        <w:t>- Start Orbiter_ng.exe (NOT Orbiter.exe) from your Orbiter installation folder. Go to the "Modules" tab and activate the "D3D9Client" module. The "Video" tab appears, configure the video settings as you like, they are quite similar to the usual Orbiter video settings. It is recommended to use "Full Screen Window" mode</w:t>
       </w:r>
       <w:r>
         <w:br/>
@@ -1160,23 +1129,7 @@
           <w:b/>
           <w:bCs/>
         </w:rPr>
-        <w:t xml:space="preserve">IMPORTANT: Click "Advanced" and add a check beside "Enable absolute animation handling" to prevent </w:t>
-      </w:r>
-      <w:proofErr w:type="gramStart"/>
-      <w:r>
-        <w:rPr>
-          <w:b/>
-          <w:bCs/>
-        </w:rPr>
-        <w:t>animation drift</w:t>
-      </w:r>
-      <w:proofErr w:type="gramEnd"/>
-      <w:r>
-        <w:rPr>
-          <w:b/>
-          <w:bCs/>
-        </w:rPr>
-        <w:t xml:space="preserve"> </w:t>
+        <w:t xml:space="preserve">IMPORTANT: Click "Advanced" and add a check beside "Enable absolute animation handling" to prevent animation drift </w:t>
       </w:r>
       <w:r>
         <w:rPr>
@@ -1211,15 +1164,7 @@
       </w:r>
       <w:r>
         <w:br/>
-        <w:t xml:space="preserve">4. Install </w:t>
-      </w:r>
-      <w:proofErr w:type="spellStart"/>
-      <w:r>
-        <w:t>XRSound</w:t>
-      </w:r>
-      <w:proofErr w:type="spellEnd"/>
-      <w:r>
-        <w:t xml:space="preserve"> 2.0: </w:t>
+        <w:t>4. Install XRSound 2.0: </w:t>
       </w:r>
       <w:hyperlink r:id="rId18" w:history="1">
         <w:r>
@@ -1251,32 +1196,27 @@
         </w:r>
       </w:hyperlink>
       <w:r>
-        <w:t xml:space="preserve"> and unzip to your Orbiter directory. Do the same with the small </w:t>
-      </w:r>
-      <w:proofErr w:type="spellStart"/>
-      <w:r>
-        <w:t>XRSound</w:t>
-      </w:r>
-      <w:proofErr w:type="spellEnd"/>
-      <w:r>
-        <w:t xml:space="preserve"> config zip file that can be found at the link as well. These files only </w:t>
+        <w:t xml:space="preserve"> and unzip to your Orbiter directory. Do the same with the small XRSound config zip file that can be found at the link as well. These files only </w:t>
       </w:r>
       <w:r>
         <w:t>must</w:t>
       </w:r>
       <w:r>
-        <w:t xml:space="preserve"> be downloaded once. They are not part of the main NASSP build so that personalized changes can be made to the sound configuration, without being overwritten by a later NASSP build.</w:t>
+        <w:t xml:space="preserve"> be downloaded once. They are not part of the main NASSP build so that personalized changes can be made to the sound configuration, without being overwritten by a later NASSP build</w:t>
       </w:r>
       <w:r>
         <w:br/>
       </w:r>
     </w:p>
+    <w:p/>
+    <w:p/>
     <w:p>
       <w:r>
         <w:rPr>
           <w:b/>
           <w:bCs/>
         </w:rPr>
+        <w:lastRenderedPageBreak/>
         <w:t>Configure Project Apollo</w:t>
       </w:r>
       <w:r>
@@ -1284,23 +1224,7 @@
           <w:b/>
           <w:bCs/>
         </w:rPr>
-        <w:t xml:space="preserve"> </w:t>
-      </w:r>
-      <w:proofErr w:type="gramStart"/>
-      <w:r>
-        <w:rPr>
-          <w:b/>
-          <w:bCs/>
-        </w:rPr>
-        <w:t>For</w:t>
-      </w:r>
-      <w:proofErr w:type="gramEnd"/>
-      <w:r>
-        <w:rPr>
-          <w:b/>
-          <w:bCs/>
-        </w:rPr>
-        <w:t xml:space="preserve"> Orbiter 2016 Beta</w:t>
+        <w:t xml:space="preserve"> For Orbiter 2016 Beta</w:t>
       </w:r>
       <w:r>
         <w:rPr>
@@ -1326,68 +1250,54 @@
         <w:t>to</w:t>
       </w:r>
       <w:r>
-        <w:t xml:space="preserve"> not have the landed LM seem sunken into/floating over the lunar terrain. You can also check "Particle streams" to see the various particle/dust </w:t>
-      </w:r>
-      <w:r>
-        <w:lastRenderedPageBreak/>
-        <w:t>effects in NASSP and "Local light sources" for the night-time launch pad lighting.</w:t>
+        <w:t xml:space="preserve"> not have the landed LM seem sunken into/floating over the lunar terrain. You can also check "Particle streams" to see the various particle/dust effects in NASSP and "Local light sources" for the night-time launch pad lighting</w:t>
       </w:r>
       <w:r>
         <w:br/>
       </w:r>
       <w:r>
         <w:br/>
-        <w:t>2. Go to the "Modules" tab and activate the "</w:t>
-      </w:r>
-      <w:proofErr w:type="spellStart"/>
-      <w:r>
-        <w:t>XRSound</w:t>
-      </w:r>
-      <w:proofErr w:type="spellEnd"/>
-      <w:r>
-        <w:t>" and "</w:t>
-      </w:r>
-      <w:proofErr w:type="spellStart"/>
-      <w:r>
-        <w:t>ProjectApolloMFD</w:t>
-      </w:r>
-      <w:proofErr w:type="spellEnd"/>
-      <w:r>
-        <w:t>" and "</w:t>
-      </w:r>
-      <w:proofErr w:type="spellStart"/>
-      <w:r>
-        <w:t>ApolloRTCCMFD</w:t>
-      </w:r>
-      <w:proofErr w:type="spellEnd"/>
-      <w:r>
-        <w:t>" modules.</w:t>
+        <w:t>2. Go to the "Modules" tab and activate the "XRSound" and "ProjectApolloMFD" and "ApolloRTCCMFD" modules</w:t>
+      </w:r>
+    </w:p>
+    <w:p>
+      <w:r>
+        <w:t>3</w:t>
+      </w:r>
+      <w:r>
+        <w:t>.</w:t>
+      </w:r>
+      <w:r>
+        <w:t xml:space="preserve"> </w:t>
+      </w:r>
+      <w:r>
+        <w:t>In Video, configure your resolution per your display, ensure if you are using multiple monitors the check box is checked and that you disable vertical sync</w:t>
+      </w:r>
+      <w:r>
+        <w:t>. Also we suggest using full screen window view</w:t>
       </w:r>
       <w:r>
         <w:br/>
       </w:r>
       <w:r>
         <w:br/>
-        <w:t xml:space="preserve">3. Go to the </w:t>
+      </w:r>
+      <w:r>
+        <w:t>4</w:t>
+      </w:r>
+      <w:r>
+        <w:t xml:space="preserve">. Go to the </w:t>
       </w:r>
       <w:r>
         <w:t>Vessel Configuration-&gt;Project Apollo Configuration</w:t>
       </w:r>
       <w:r>
-        <w:t xml:space="preserve"> on the "Extra" tab. If you have a joystick, this is where you can configure your joystick for use in NASSP. Do not use the normal Orbiter controls page to configure your joystick, there it should be &lt;Disabled&gt;. In the "Miscellaneous" tab, make sure "Multi-Threading in time acceleration" is checked. It is also recommended to set a limit for time </w:t>
-      </w:r>
-      <w:proofErr w:type="gramStart"/>
-      <w:r>
-        <w:t>acceleration,</w:t>
-      </w:r>
-      <w:proofErr w:type="gramEnd"/>
-      <w:r>
-        <w:t xml:space="preserve"> NASSP runs best at 50x or less depending on the hardware you are using.</w:t>
-      </w:r>
-    </w:p>
-    <w:p>
-      <w:r>
-        <w:t>4</w:t>
+        <w:t xml:space="preserve"> on the "Extra" tab. If you have a joystick, this is where you can configure your joystick for use in NASSP. Do not use the normal Orbiter controls page to configure your joystick, there it should be &lt;Disabled&gt;. In the "Miscellaneous" tab, make sure "Multi-Threading in time acceleration" is checked. It is also recommended to set a limit for time acceleration, NASSP runs best at 50x or less depending on the hardware you are using</w:t>
+      </w:r>
+    </w:p>
+    <w:p>
+      <w:r>
+        <w:t>5</w:t>
       </w:r>
       <w:r>
         <w:t>.</w:t>
@@ -1407,13 +1317,8 @@
       <w:r>
         <w:t xml:space="preserve">Vessel Configuration -&gt; Project Apollo Configuration </w:t>
       </w:r>
-      <w:proofErr w:type="gramStart"/>
-      <w:r>
-        <w:t>make</w:t>
-      </w:r>
-      <w:proofErr w:type="gramEnd"/>
-      <w:r>
-        <w:t xml:space="preserve"> sure mesh is set to high resolution, FDAI is on smooth scrolling, and on the miscellaneous tab, check multi-threading in time acceleration</w:t>
+      <w:r>
+        <w:t>make sure mesh is set to high resolution, FDAI is on smooth scrolling, and on the miscellaneous tab, check multi-threading in time acceleration</w:t>
       </w:r>
       <w:r>
         <w:t>. You can optionally choose to limit max acceleration (useful to not “over warp”) and a debug line that appears in the LPD view in the virtual cockpit that displays landing information that would normally be called out by the LMP</w:t>
@@ -1421,36 +1326,20 @@
     </w:p>
     <w:p>
       <w:r>
-        <w:t>5</w:t>
+        <w:t>6</w:t>
       </w:r>
       <w:r>
         <w:t>.</w:t>
       </w:r>
       <w:r>
-        <w:t xml:space="preserve"> (Optional) If you would like to enable autosave, you can do that in the Extra -&gt; Vessel Configuration -&gt; Project Apollo Configuration -&gt; Autosave. Enabling this will cause the sim to save on an interval set in the settings and save to the Scenarios/Autosave/&lt;mission&gt; in the format GET-&lt;</w:t>
-      </w:r>
-      <w:proofErr w:type="spellStart"/>
-      <w:r>
-        <w:t>hhh</w:t>
-      </w:r>
-      <w:proofErr w:type="spellEnd"/>
-      <w:proofErr w:type="gramStart"/>
-      <w:r>
-        <w:t>&gt;.&lt;</w:t>
-      </w:r>
-      <w:proofErr w:type="gramEnd"/>
-      <w:r>
-        <w:t>mm</w:t>
-      </w:r>
-      <w:proofErr w:type="gramStart"/>
-      <w:r>
-        <w:t>&gt;.&lt;</w:t>
-      </w:r>
-      <w:proofErr w:type="gramEnd"/>
-      <w:r>
-        <w:t xml:space="preserve">ss&gt;. </w:t>
-      </w:r>
-    </w:p>
+        <w:t xml:space="preserve"> (Optional) If you would like to enable autosave, you can do that in the Extra -&gt; Vessel Configuration -&gt; Project Apollo Configuration -&gt; Autosave. Enabling this will cause the sim to save on an interval set in the settings and save to the Scenarios/Autosave/&lt;mission&gt; in the format GET-&lt;hhh&gt;.&lt;mm&gt;.&lt;ss&gt;</w:t>
+      </w:r>
+    </w:p>
+    <w:p/>
+    <w:p/>
+    <w:p/>
+    <w:p/>
+    <w:p/>
     <w:p>
       <w:pPr>
         <w:rPr>
@@ -1459,16 +1348,11 @@
         </w:rPr>
       </w:pPr>
       <w:r>
-        <w:br/>
-      </w:r>
-      <w:r>
-        <w:br/>
-      </w:r>
-      <w:r>
         <w:rPr>
           <w:b/>
           <w:bCs/>
         </w:rPr>
+        <w:lastRenderedPageBreak/>
         <w:t>How to update NASSP</w:t>
       </w:r>
       <w:r>
@@ -1589,9 +1473,137 @@
     </w:p>
     <w:p>
       <w:pPr>
+        <w:rPr>
+          <w:b/>
+          <w:bCs/>
+        </w:rPr>
+      </w:pPr>
+    </w:p>
+    <w:p>
+      <w:pPr>
+        <w:rPr>
+          <w:b/>
+          <w:bCs/>
+        </w:rPr>
+      </w:pPr>
+    </w:p>
+    <w:p>
+      <w:pPr>
+        <w:rPr>
+          <w:b/>
+          <w:bCs/>
+        </w:rPr>
+      </w:pPr>
+    </w:p>
+    <w:p>
+      <w:pPr>
+        <w:rPr>
+          <w:b/>
+          <w:bCs/>
+        </w:rPr>
+      </w:pPr>
+    </w:p>
+    <w:p>
+      <w:pPr>
+        <w:rPr>
+          <w:b/>
+          <w:bCs/>
+        </w:rPr>
+      </w:pPr>
+    </w:p>
+    <w:p>
+      <w:pPr>
+        <w:rPr>
+          <w:b/>
+          <w:bCs/>
+        </w:rPr>
+      </w:pPr>
+    </w:p>
+    <w:p>
+      <w:pPr>
+        <w:rPr>
+          <w:b/>
+          <w:bCs/>
+        </w:rPr>
+      </w:pPr>
+    </w:p>
+    <w:p>
+      <w:pPr>
+        <w:rPr>
+          <w:b/>
+          <w:bCs/>
+        </w:rPr>
+      </w:pPr>
+    </w:p>
+    <w:p>
+      <w:pPr>
+        <w:rPr>
+          <w:b/>
+          <w:bCs/>
+        </w:rPr>
+      </w:pPr>
+    </w:p>
+    <w:p>
+      <w:pPr>
+        <w:rPr>
+          <w:b/>
+          <w:bCs/>
+        </w:rPr>
+      </w:pPr>
+    </w:p>
+    <w:p>
+      <w:pPr>
+        <w:rPr>
+          <w:b/>
+          <w:bCs/>
+        </w:rPr>
+      </w:pPr>
+    </w:p>
+    <w:p>
+      <w:pPr>
+        <w:rPr>
+          <w:b/>
+          <w:bCs/>
+        </w:rPr>
+      </w:pPr>
+    </w:p>
+    <w:p>
+      <w:pPr>
+        <w:rPr>
+          <w:b/>
+          <w:bCs/>
+        </w:rPr>
+      </w:pPr>
+    </w:p>
+    <w:p>
+      <w:pPr>
+        <w:rPr>
+          <w:b/>
+          <w:bCs/>
+        </w:rPr>
+      </w:pPr>
+    </w:p>
+    <w:p>
+      <w:pPr>
+        <w:rPr>
+          <w:b/>
+          <w:bCs/>
+        </w:rPr>
+      </w:pPr>
+    </w:p>
+    <w:p>
+      <w:pPr>
+        <w:rPr>
+          <w:b/>
+          <w:bCs/>
+        </w:rPr>
+      </w:pPr>
+    </w:p>
+    <w:p>
+      <w:pPr>
         <w:pStyle w:val="Heading1"/>
       </w:pPr>
-      <w:bookmarkStart w:id="1" w:name="_Toc241405946"/>
+      <w:bookmarkStart w:id="1" w:name="_Toc242456623"/>
       <w:r>
         <w:lastRenderedPageBreak/>
         <w:t xml:space="preserve">Installation (NASSP </w:t>
@@ -1727,15 +1739,7 @@
         <w:t xml:space="preserve"> </w:t>
       </w:r>
       <w:r>
-        <w:t xml:space="preserve">This contains only </w:t>
-      </w:r>
-      <w:proofErr w:type="gramStart"/>
-      <w:r>
-        <w:t>Low Res</w:t>
-      </w:r>
-      <w:proofErr w:type="gramEnd"/>
-      <w:r>
-        <w:t xml:space="preserve"> textures</w:t>
+        <w:t>This contains only Low Res textures</w:t>
       </w:r>
     </w:p>
     <w:p>
@@ -1885,39 +1889,7 @@
         <w:t>g</w:t>
       </w:r>
       <w:r>
-        <w:t>o to the "Modules" tab and activate the "</w:t>
-      </w:r>
-      <w:proofErr w:type="spellStart"/>
-      <w:r>
-        <w:t>ExtMFD</w:t>
-      </w:r>
-      <w:proofErr w:type="spellEnd"/>
-      <w:r>
-        <w:t xml:space="preserve">", </w:t>
-      </w:r>
-      <w:proofErr w:type="spellStart"/>
-      <w:r>
-        <w:t>XRSound</w:t>
-      </w:r>
-      <w:proofErr w:type="spellEnd"/>
-      <w:r>
-        <w:t>", "</w:t>
-      </w:r>
-      <w:proofErr w:type="spellStart"/>
-      <w:r>
-        <w:t>ProjectApolloMFD</w:t>
-      </w:r>
-      <w:proofErr w:type="spellEnd"/>
-      <w:r>
-        <w:t>" and "</w:t>
-      </w:r>
-      <w:proofErr w:type="spellStart"/>
-      <w:r>
-        <w:t>ApolloRTCCMFD</w:t>
-      </w:r>
-      <w:proofErr w:type="spellEnd"/>
-      <w:r>
-        <w:t>" modules. Do not use the DX9MFD as it is known to cause crashes</w:t>
+        <w:t>o to the "Modules" tab and activate the "ExtMFD", XRSound", "ProjectApolloMFD" and "ApolloRTCCMFD" modules. Do not use the DX9MFD as it is known to cause crashes</w:t>
       </w:r>
     </w:p>
     <w:p>
@@ -1928,15 +1900,7 @@
         <w:t>.</w:t>
       </w:r>
       <w:r>
-        <w:t xml:space="preserve"> In Options-&gt;Visual Settings make sure "local light sources" </w:t>
-      </w:r>
-      <w:proofErr w:type="gramStart"/>
-      <w:r>
-        <w:t>is</w:t>
-      </w:r>
-      <w:proofErr w:type="gramEnd"/>
-      <w:r>
-        <w:t xml:space="preserve"> enabled,</w:t>
+        <w:t xml:space="preserve"> In Options-&gt;Visual Settings make sure "local light sources" is enabled,</w:t>
       </w:r>
       <w:r>
         <w:t xml:space="preserve"> enable </w:t>
@@ -2043,6 +2007,26 @@
         <w:t>.</w:t>
       </w:r>
       <w:r>
+        <w:t xml:space="preserve"> </w:t>
+      </w:r>
+      <w:r>
+        <w:t>In Video, c</w:t>
+      </w:r>
+      <w:r>
+        <w:t>onfigure your resolution per your display</w:t>
+      </w:r>
+      <w:r>
+        <w:t>, ensure if you are using multiple monitors the check box is checked and that you disable vertical sync</w:t>
+      </w:r>
+    </w:p>
+    <w:p>
+      <w:r>
+        <w:t>10</w:t>
+      </w:r>
+      <w:r>
+        <w:t>.</w:t>
+      </w:r>
+      <w:r>
         <w:t xml:space="preserve"> In the advanced settings of video, configure however you wish, but you must have "enable absolute animation handling" checked and texture mipmaps must be set to "load as defined</w:t>
       </w:r>
       <w:r>
@@ -2057,7 +2041,10 @@
     </w:p>
     <w:p>
       <w:r>
-        <w:t>10</w:t>
+        <w:t>1</w:t>
+      </w:r>
+      <w:r>
+        <w:t>1</w:t>
       </w:r>
       <w:r>
         <w:t>.</w:t>
@@ -2083,66 +2070,51 @@
         <w:t>1</w:t>
       </w:r>
       <w:r>
+        <w:t>2</w:t>
+      </w:r>
+      <w:r>
+        <w:t>.</w:t>
+      </w:r>
+      <w:r>
+        <w:t xml:space="preserve"> </w:t>
+      </w:r>
+      <w:r>
+        <w:t>I</w:t>
+      </w:r>
+      <w:r>
+        <w:t>n Extra</w:t>
+      </w:r>
+      <w:r>
+        <w:t>-&gt;</w:t>
+      </w:r>
+      <w:r>
+        <w:t xml:space="preserve">Vessel Configuration -&gt; Project Apollo Configuration </w:t>
+      </w:r>
+      <w:r>
+        <w:t xml:space="preserve">make sure mesh is set to high resolution, FDAI is on smooth scrolling, and on the miscellaneous tab, check </w:t>
+      </w:r>
+      <w:r>
+        <w:t>multi-threading</w:t>
+      </w:r>
+      <w:r>
+        <w:t xml:space="preserve"> in time acceleration</w:t>
+      </w:r>
+      <w:r>
+        <w:t>. You can optionally choose to limit max acceleration (useful to not “over warp”) and a debug line that appears in the LPD view in the virtual cockpit that displays landing information that would normally be called out by the LMP</w:t>
+      </w:r>
+    </w:p>
+    <w:p>
+      <w:r>
         <w:t>1</w:t>
       </w:r>
       <w:r>
+        <w:t>3</w:t>
+      </w:r>
+      <w:r>
         <w:t>.</w:t>
       </w:r>
       <w:r>
-        <w:t xml:space="preserve"> </w:t>
-      </w:r>
-      <w:r>
-        <w:t>I</w:t>
-      </w:r>
-      <w:r>
-        <w:t>n Extra</w:t>
-      </w:r>
-      <w:r>
-        <w:t>-&gt;</w:t>
-      </w:r>
-      <w:r>
-        <w:t xml:space="preserve">Vessel Configuration -&gt; Project Apollo Configuration </w:t>
-      </w:r>
-      <w:r>
-        <w:t xml:space="preserve">make sure mesh is set to high resolution, FDAI is on smooth scrolling, and on the miscellaneous tab, check </w:t>
-      </w:r>
-      <w:r>
-        <w:t>multi-threading</w:t>
-      </w:r>
-      <w:r>
-        <w:t xml:space="preserve"> in time acceleration</w:t>
-      </w:r>
-      <w:r>
-        <w:t>. You can optionally choose to limit max acceleration (useful to not “over warp”) and a debug line that appears in the LPD view in the virtual cockpit that displays landing information that would normally be called out by the LMP</w:t>
-      </w:r>
-    </w:p>
-    <w:p>
-      <w:r>
-        <w:t>12.</w:t>
-      </w:r>
-      <w:r>
-        <w:t xml:space="preserve"> (Optional) If you would like to enable autosave, you can do that in the Extra -&gt; Vessel Configuration -&gt; Project Apollo Configuration -&gt; Autosave. Enabling this will cause the sim to save on an interval set in the settings and save to the Scenarios/Autosave/&lt;mission&gt; in the format GET-&lt;</w:t>
-      </w:r>
-      <w:proofErr w:type="spellStart"/>
-      <w:r>
-        <w:t>hhh</w:t>
-      </w:r>
-      <w:proofErr w:type="spellEnd"/>
-      <w:proofErr w:type="gramStart"/>
-      <w:r>
-        <w:t>&gt;.&lt;</w:t>
-      </w:r>
-      <w:proofErr w:type="gramEnd"/>
-      <w:r>
-        <w:t>mm</w:t>
-      </w:r>
-      <w:proofErr w:type="gramStart"/>
-      <w:r>
-        <w:t>&gt;.&lt;</w:t>
-      </w:r>
-      <w:proofErr w:type="gramEnd"/>
-      <w:r>
-        <w:t xml:space="preserve">ss&gt;. </w:t>
+        <w:t xml:space="preserve"> (Optional) If you would like to enable autosave, you can do that in the Extra -&gt; Vessel Configuration -&gt; Project Apollo Configuration -&gt; Autosave. Enabling this will cause the sim to save on an interval set in the settings and save to the Scenarios/Autosave/&lt;mission&gt; in the format GET-&lt;hhh&gt;.&lt;mm&gt;.&lt;ss&gt;</w:t>
       </w:r>
     </w:p>
     <w:p/>
@@ -2163,7 +2135,7 @@
       <w:pPr>
         <w:pStyle w:val="Heading1"/>
       </w:pPr>
-      <w:bookmarkStart w:id="2" w:name="_Toc241405947"/>
+      <w:bookmarkStart w:id="2" w:name="_Toc242456624"/>
       <w:r>
         <w:lastRenderedPageBreak/>
         <w:t>Tips For Beginners:</w:t>
@@ -2189,15 +2161,7 @@
         <w:br/>
       </w:r>
       <w:r>
-        <w:t xml:space="preserve">That's ultimately up to you, but we generally recommend Apollo 8. While Apollo 7 is chronologically first, it's a very long mission that is meant to test vehicle systems and procedures from the relative safety of low Earth orbit. As such, it involves a very unusual and often repetitive schedule, with procedures that are rather unrefined. Apollo 8, by contrast, is a relatively short mission with more straightforward goals and mission design. You get to experience most of the lunar mission milestones without needing to worry about managing two separate vehicles on your first journey. After Apollo 8 concludes, Apollo 11 or 12 would be our next recommendation. You get to use </w:t>
-      </w:r>
-      <w:proofErr w:type="gramStart"/>
-      <w:r>
-        <w:t>the LM</w:t>
-      </w:r>
-      <w:proofErr w:type="gramEnd"/>
-      <w:r>
-        <w:t xml:space="preserve"> and land on the moon, and the procedures have been improved and optimized thanks to the lessons learned on all the previous missions.</w:t>
+        <w:t>That's ultimately up to you, but we generally recommend Apollo 8. While Apollo 7 is chronologically first, it's a very long mission that is meant to test vehicle systems and procedures from the relative safety of low Earth orbit. As such, it involves a very unusual and often repetitive schedule, with procedures that are rather unrefined. Apollo 8, by contrast, is a relatively short mission with more straightforward goals and mission design. You get to experience most of the lunar mission milestones without needing to worry about managing two separate vehicles on your first journey. After Apollo 8 concludes, Apollo 11 or 12 would be our next recommendation. You get to use the LM and land on the moon, and the procedures have been improved and optimized thanks to the lessons learned on all the previous missions.</w:t>
       </w:r>
       <w:r>
         <w:br/>
@@ -2375,29 +2339,13 @@
         <w:br/>
       </w:r>
       <w:r>
-        <w:t xml:space="preserve">These are </w:t>
-      </w:r>
-      <w:proofErr w:type="gramStart"/>
-      <w:r>
-        <w:t>pretty easy</w:t>
-      </w:r>
-      <w:proofErr w:type="gramEnd"/>
-      <w:r>
-        <w:t xml:space="preserve">. You can </w:t>
+        <w:t xml:space="preserve">These are pretty easy. You can </w:t>
       </w:r>
       <w:r>
         <w:t>click on the left</w:t>
       </w:r>
       <w:r>
-        <w:t xml:space="preserve"> circuit breakers to close or open them. For computer keys like the DSKY or DEDA, just click on each button to press it. If you find that the computer isn't always responding to your key presses, you may be letting go of the button too quickly. Each computer key needs to be held for a small fraction of a second, and sometimes a fast click doesn't hold the button down for quite long enough. You don't need to hold them for a long time, only for </w:t>
-      </w:r>
-      <w:proofErr w:type="gramStart"/>
-      <w:r>
-        <w:t>a brief moment</w:t>
-      </w:r>
-      <w:proofErr w:type="gramEnd"/>
-      <w:r>
-        <w:t xml:space="preserve"> to ensure they register.</w:t>
+        <w:t xml:space="preserve"> circuit breakers to close or open them. For computer keys like the DSKY or DEDA, just click on each button to press it. If you find that the computer isn't always responding to your key presses, you may be letting go of the button too quickly. Each computer key needs to be held for a small fraction of a second, and sometimes a fast click doesn't hold the button down for quite long enough. You don't need to hold them for a long time, only for a brief moment to ensure they register.</w:t>
       </w:r>
       <w:r>
         <w:br/>
@@ -2462,15 +2410,7 @@
         <w:ind w:left="360"/>
       </w:pPr>
       <w:r>
-        <w:t xml:space="preserve">Thumbwheels are the vertical numbered controls, found on the gimbal trim control panel and the attitude set control panel. Left-click the upper or lower part of each thumbwheel to increase/decrease its value by 1, or right-click them to increase/decrease by 0.1. The </w:t>
-      </w:r>
-      <w:proofErr w:type="spellStart"/>
-      <w:r>
-        <w:t>dV</w:t>
-      </w:r>
-      <w:proofErr w:type="spellEnd"/>
-      <w:r>
-        <w:t xml:space="preserve">/Range Set switch on the EMS works similarly: hold the switch on the top or bottom to increase or decrease the </w:t>
+        <w:t xml:space="preserve">Thumbwheels are the vertical numbered controls, found on the gimbal trim control panel and the attitude set control panel. Left-click the upper or lower part of each thumbwheel to increase/decrease its value by 1, or right-click them to increase/decrease by 0.1. The dV/Range Set switch on the EMS works similarly: hold the switch on the top or bottom to increase or decrease the </w:t>
       </w:r>
       <w:r>
         <w:t>value and</w:t>
@@ -2498,15 +2438,7 @@
         <w:ind w:left="360"/>
       </w:pPr>
       <w:r>
-        <w:t>While the 2D cockpit has MFDs built right into its main panel, the 3D cockpit does not. To open an MFD in the 3D cockpit, move your mouse near the top of the Orbiter window. A menu bar should drop down. Click on "Function" and then choose "External MFD". If this option does not appear, make sure the "</w:t>
-      </w:r>
-      <w:proofErr w:type="spellStart"/>
-      <w:r>
-        <w:t>ExtMFD</w:t>
-      </w:r>
-      <w:proofErr w:type="spellEnd"/>
-      <w:r>
-        <w:t>" module is enabled in the Orbiter settings.</w:t>
+        <w:t>While the 2D cockpit has MFDs built right into its main panel, the 3D cockpit does not. To open an MFD in the 3D cockpit, move your mouse near the top of the Orbiter window. A menu bar should drop down. Click on "Function" and then choose "External MFD". If this option does not appear, make sure the "ExtMFD" module is enabled in the Orbiter settings.</w:t>
       </w:r>
     </w:p>
     <w:p>
@@ -2691,23 +2623,7 @@
           <w:b/>
           <w:bCs/>
         </w:rPr>
-        <w:t xml:space="preserve"> keep </w:t>
-      </w:r>
-      <w:proofErr w:type="gramStart"/>
-      <w:r>
-        <w:rPr>
-          <w:b/>
-          <w:bCs/>
-        </w:rPr>
-        <w:t>your save</w:t>
-      </w:r>
-      <w:proofErr w:type="gramEnd"/>
-      <w:r>
-        <w:rPr>
-          <w:b/>
-          <w:bCs/>
-        </w:rPr>
-        <w:t xml:space="preserve"> files organized!</w:t>
+        <w:t xml:space="preserve"> keep your save files organized!</w:t>
       </w:r>
       <w:r>
         <w:t> </w:t>
@@ -2833,32 +2749,16 @@
         <w:t>time warp</w:t>
       </w:r>
       <w:r>
-        <w:t xml:space="preserve"> normally. It will even affect vessels that you're not currently </w:t>
-      </w:r>
-      <w:proofErr w:type="gramStart"/>
-      <w:r>
-        <w:t>controlling:</w:t>
-      </w:r>
-      <w:proofErr w:type="gramEnd"/>
-      <w:r>
-        <w:t xml:space="preserve"> </w:t>
+        <w:t xml:space="preserve"> normally. It will even affect vessels that you're not currently controlling: </w:t>
       </w:r>
       <w:r>
         <w:t>time warping</w:t>
       </w:r>
       <w:r>
-        <w:t xml:space="preserve"> in the CSM while the LM is trying to hold attitude will cause problems for the LM. Usually going up to about 5x or 10x is safe. If you want </w:t>
-      </w:r>
-      <w:proofErr w:type="gramStart"/>
-      <w:r>
-        <w:t xml:space="preserve">to </w:t>
-      </w:r>
-      <w:r>
-        <w:t>time</w:t>
-      </w:r>
-      <w:proofErr w:type="gramEnd"/>
-      <w:r>
-        <w:t xml:space="preserve"> warp</w:t>
+        <w:t xml:space="preserve"> in the CSM while the LM is trying to hold attitude will cause problems for the LM. Usually going up to about 5x or 10x is safe. If you want to </w:t>
+      </w:r>
+      <w:r>
+        <w:t>time warp</w:t>
       </w:r>
       <w:r>
         <w:t xml:space="preserve"> faster, be sure to disable any kind of attitude-hold mode in the CSM and LM before </w:t>
@@ -2895,23 +2795,7 @@
         <w:br/>
       </w:r>
       <w:r>
-        <w:t xml:space="preserve">When you're performing LM activation, be sure to use </w:t>
-      </w:r>
-      <w:proofErr w:type="gramStart"/>
-      <w:r>
-        <w:t>the Project</w:t>
-      </w:r>
-      <w:proofErr w:type="gramEnd"/>
-      <w:r>
-        <w:t xml:space="preserve"> Apollo MFD's "ECS" section to connect the O2 hose from the CSM. This creates a flow of fresh oxygen into the LM so that the cabin doesn't fill up with deadly CO2 and </w:t>
-      </w:r>
-      <w:proofErr w:type="gramStart"/>
-      <w:r>
-        <w:t>poison</w:t>
-      </w:r>
-      <w:proofErr w:type="gramEnd"/>
-      <w:r>
-        <w:t xml:space="preserve"> your crew before the LM ECS is activated. Having this O2 hose connected also prevents you from closing the CSM forward hatch, so if you can't get it </w:t>
+        <w:t xml:space="preserve">When you're performing LM activation, be sure to use the Project Apollo MFD's "ECS" section to connect the O2 hose from the CSM. This creates a flow of fresh oxygen into the LM so that the cabin doesn't fill up with deadly CO2 and poison your crew before the LM ECS is activated. Having this O2 hose connected also prevents you from closing the CSM forward hatch, so if you can't get it </w:t>
       </w:r>
       <w:r>
         <w:t>too</w:t>
@@ -2946,11 +2830,9 @@
       <w:r>
         <w:t xml:space="preserve">LM crew can be in the cabin (unsuited), or suits with a </w:t>
       </w:r>
-      <w:proofErr w:type="gramStart"/>
-      <w:r>
-        <w:t>toggleable helmet gloves</w:t>
-      </w:r>
-      <w:proofErr w:type="gramEnd"/>
+      <w:r>
+        <w:t>toggleable helmet/glove</w:t>
+      </w:r>
       <w:r>
         <w:t xml:space="preserve"> on or off option.</w:t>
       </w:r>
@@ -2996,15 +2878,7 @@
         <w:ind w:left="360"/>
       </w:pPr>
       <w:r>
-        <w:t xml:space="preserve">If you look carefully, you will notice there are Velcro patches around the CM and LM. Clicking these will allow you to utilize various mission cue cards, window shades, glareshields etc. that were used during flight. One caveat is they are mostly Apollo 15 cue cards currently, so keep that in mind when flying other flights. We are working to find/create more mission specific cue cards </w:t>
-      </w:r>
-      <w:proofErr w:type="gramStart"/>
-      <w:r>
-        <w:t>in the near future</w:t>
-      </w:r>
-      <w:proofErr w:type="gramEnd"/>
-      <w:r>
-        <w:t>.</w:t>
+        <w:t>If you look carefully, you will notice there are Velcro patches around the CM and LM. Clicking these will allow you to utilize various mission cue cards, window shades, glareshields etc. that were used during flight. One caveat is they are mostly Apollo 15 cue cards currently, so keep that in mind when flying other flights. We are working to find/create more mission specific cue cards in the near future.</w:t>
       </w:r>
     </w:p>
     <w:p>
@@ -3121,7 +2995,7 @@
       <w:pPr>
         <w:pStyle w:val="Heading1"/>
       </w:pPr>
-      <w:bookmarkStart w:id="3" w:name="_Toc241405948"/>
+      <w:bookmarkStart w:id="3" w:name="_Toc242456625"/>
       <w:r>
         <w:lastRenderedPageBreak/>
         <w:t>Keyboard Commands:</w:t>
@@ -3632,7 +3506,6 @@
                 <w14:ligatures w14:val="none"/>
               </w:rPr>
             </w:pPr>
-            <w:proofErr w:type="spellStart"/>
             <w:r>
               <w:rPr>
                 <w:rFonts w:eastAsia="Times New Roman" w:cs="Times New Roman"/>
@@ -3642,7 +3515,6 @@
               </w:rPr>
               <w:t>Ctrl+Alt+S</w:t>
             </w:r>
-            <w:proofErr w:type="spellEnd"/>
           </w:p>
         </w:tc>
         <w:tc>
@@ -3674,19 +3546,8 @@
                 <w:kern w:val="0"/>
                 <w14:ligatures w14:val="none"/>
               </w:rPr>
-              <w:t xml:space="preserve">Generate Mission Time-Stamped </w:t>
-            </w:r>
-            <w:proofErr w:type="spellStart"/>
-            <w:r>
-              <w:rPr>
-                <w:rFonts w:eastAsia="Times New Roman" w:cs="Times New Roman"/>
-                <w:color w:val="000000"/>
-                <w:kern w:val="0"/>
-                <w14:ligatures w14:val="none"/>
-              </w:rPr>
-              <w:t>Quicksave</w:t>
-            </w:r>
-            <w:proofErr w:type="spellEnd"/>
+              <w:t>Generate Mission Time-Stamped Quicksave</w:t>
+            </w:r>
           </w:p>
         </w:tc>
       </w:tr>
@@ -4134,7 +3995,6 @@
                 <w14:ligatures w14:val="none"/>
               </w:rPr>
             </w:pPr>
-            <w:proofErr w:type="spellStart"/>
             <w:r>
               <w:rPr>
                 <w:rFonts w:eastAsia="Times New Roman" w:cs="Times New Roman"/>
@@ -4144,7 +4004,6 @@
               </w:rPr>
               <w:t>Ctrl+H</w:t>
             </w:r>
-            <w:proofErr w:type="spellEnd"/>
           </w:p>
         </w:tc>
         <w:tc>
@@ -4746,7 +4605,6 @@
                 <w14:ligatures w14:val="none"/>
               </w:rPr>
             </w:pPr>
-            <w:proofErr w:type="spellStart"/>
             <w:r>
               <w:rPr>
                 <w:rFonts w:eastAsia="Times New Roman" w:cs="Times New Roman"/>
@@ -4756,7 +4614,6 @@
               </w:rPr>
               <w:t>Alt+Numpad</w:t>
             </w:r>
-            <w:proofErr w:type="spellEnd"/>
           </w:p>
         </w:tc>
         <w:tc>
@@ -4781,7 +4638,6 @@
                 <w14:ligatures w14:val="none"/>
               </w:rPr>
             </w:pPr>
-            <w:proofErr w:type="spellStart"/>
             <w:r>
               <w:rPr>
                 <w:rFonts w:eastAsia="Times New Roman" w:cs="Times New Roman"/>
@@ -4791,7 +4647,6 @@
               </w:rPr>
               <w:t>Hardover</w:t>
             </w:r>
-            <w:proofErr w:type="spellEnd"/>
           </w:p>
         </w:tc>
       </w:tr>
@@ -5080,25 +4935,14 @@
                 <w14:ligatures w14:val="none"/>
               </w:rPr>
             </w:pPr>
-            <w:proofErr w:type="spellStart"/>
-            <w:r>
-              <w:rPr>
-                <w:rFonts w:eastAsia="Times New Roman" w:cs="Times New Roman"/>
-                <w:color w:val="000000"/>
-                <w:kern w:val="0"/>
-                <w14:ligatures w14:val="none"/>
-              </w:rPr>
-              <w:t>Shift+Decimal</w:t>
-            </w:r>
-            <w:proofErr w:type="spellEnd"/>
-            <w:r>
-              <w:rPr>
-                <w:rFonts w:eastAsia="Times New Roman" w:cs="Times New Roman"/>
-                <w:color w:val="000000"/>
-                <w:kern w:val="0"/>
-                <w14:ligatures w14:val="none"/>
-              </w:rPr>
-              <w:t xml:space="preserve"> (Numpad)</w:t>
+            <w:r>
+              <w:rPr>
+                <w:rFonts w:eastAsia="Times New Roman" w:cs="Times New Roman"/>
+                <w:color w:val="000000"/>
+                <w:kern w:val="0"/>
+                <w14:ligatures w14:val="none"/>
+              </w:rPr>
+              <w:t>Shift+Decimal (Numpad)</w:t>
             </w:r>
           </w:p>
         </w:tc>
@@ -5164,25 +5008,14 @@
                 <w14:ligatures w14:val="none"/>
               </w:rPr>
             </w:pPr>
-            <w:proofErr w:type="spellStart"/>
-            <w:r>
-              <w:rPr>
-                <w:rFonts w:eastAsia="Times New Roman" w:cs="Times New Roman"/>
-                <w:color w:val="000000"/>
-                <w:kern w:val="0"/>
-                <w14:ligatures w14:val="none"/>
-              </w:rPr>
-              <w:t>Shift+Page</w:t>
-            </w:r>
-            <w:proofErr w:type="spellEnd"/>
-            <w:r>
-              <w:rPr>
-                <w:rFonts w:eastAsia="Times New Roman" w:cs="Times New Roman"/>
-                <w:color w:val="000000"/>
-                <w:kern w:val="0"/>
-                <w14:ligatures w14:val="none"/>
-              </w:rPr>
-              <w:t xml:space="preserve"> Up</w:t>
+            <w:r>
+              <w:rPr>
+                <w:rFonts w:eastAsia="Times New Roman" w:cs="Times New Roman"/>
+                <w:color w:val="000000"/>
+                <w:kern w:val="0"/>
+                <w14:ligatures w14:val="none"/>
+              </w:rPr>
+              <w:t>Shift+Page Up</w:t>
             </w:r>
           </w:p>
         </w:tc>
@@ -5248,7 +5081,6 @@
                 <w14:ligatures w14:val="none"/>
               </w:rPr>
             </w:pPr>
-            <w:proofErr w:type="spellStart"/>
             <w:r>
               <w:rPr>
                 <w:rFonts w:eastAsia="Times New Roman" w:cs="Times New Roman"/>
@@ -5258,7 +5090,6 @@
               </w:rPr>
               <w:t>Shift+Home</w:t>
             </w:r>
-            <w:proofErr w:type="spellEnd"/>
           </w:p>
         </w:tc>
         <w:tc>
@@ -5396,25 +5227,14 @@
                 <w14:ligatures w14:val="none"/>
               </w:rPr>
             </w:pPr>
-            <w:proofErr w:type="spellStart"/>
-            <w:r>
-              <w:rPr>
-                <w:rFonts w:eastAsia="Times New Roman" w:cs="Times New Roman"/>
-                <w:color w:val="000000"/>
-                <w:kern w:val="0"/>
-                <w14:ligatures w14:val="none"/>
-              </w:rPr>
-              <w:t>Shift+Divide</w:t>
-            </w:r>
-            <w:proofErr w:type="spellEnd"/>
-            <w:r>
-              <w:rPr>
-                <w:rFonts w:eastAsia="Times New Roman" w:cs="Times New Roman"/>
-                <w:color w:val="000000"/>
-                <w:kern w:val="0"/>
-                <w14:ligatures w14:val="none"/>
-              </w:rPr>
-              <w:t xml:space="preserve"> (Numpad /)</w:t>
+            <w:r>
+              <w:rPr>
+                <w:rFonts w:eastAsia="Times New Roman" w:cs="Times New Roman"/>
+                <w:color w:val="000000"/>
+                <w:kern w:val="0"/>
+                <w14:ligatures w14:val="none"/>
+              </w:rPr>
+              <w:t>Shift+Divide (Numpad /)</w:t>
             </w:r>
           </w:p>
         </w:tc>
@@ -5480,25 +5300,14 @@
                 <w14:ligatures w14:val="none"/>
               </w:rPr>
             </w:pPr>
-            <w:proofErr w:type="spellStart"/>
-            <w:r>
-              <w:rPr>
-                <w:rFonts w:eastAsia="Times New Roman" w:cs="Times New Roman"/>
-                <w:color w:val="000000"/>
-                <w:kern w:val="0"/>
-                <w14:ligatures w14:val="none"/>
-              </w:rPr>
-              <w:t>Shift+Multiply</w:t>
-            </w:r>
-            <w:proofErr w:type="spellEnd"/>
-            <w:r>
-              <w:rPr>
-                <w:rFonts w:eastAsia="Times New Roman" w:cs="Times New Roman"/>
-                <w:color w:val="000000"/>
-                <w:kern w:val="0"/>
-                <w14:ligatures w14:val="none"/>
-              </w:rPr>
-              <w:t xml:space="preserve"> (Numpad *)</w:t>
+            <w:r>
+              <w:rPr>
+                <w:rFonts w:eastAsia="Times New Roman" w:cs="Times New Roman"/>
+                <w:color w:val="000000"/>
+                <w:kern w:val="0"/>
+                <w14:ligatures w14:val="none"/>
+              </w:rPr>
+              <w:t>Shift+Multiply (Numpad *)</w:t>
             </w:r>
           </w:p>
         </w:tc>
@@ -5564,25 +5373,14 @@
                 <w14:ligatures w14:val="none"/>
               </w:rPr>
             </w:pPr>
-            <w:proofErr w:type="spellStart"/>
-            <w:r>
-              <w:rPr>
-                <w:rFonts w:eastAsia="Times New Roman" w:cs="Times New Roman"/>
-                <w:color w:val="000000"/>
-                <w:kern w:val="0"/>
-                <w14:ligatures w14:val="none"/>
-              </w:rPr>
-              <w:t>Shift+Plus</w:t>
-            </w:r>
-            <w:proofErr w:type="spellEnd"/>
-            <w:r>
-              <w:rPr>
-                <w:rFonts w:eastAsia="Times New Roman" w:cs="Times New Roman"/>
-                <w:color w:val="000000"/>
-                <w:kern w:val="0"/>
-                <w14:ligatures w14:val="none"/>
-              </w:rPr>
-              <w:t xml:space="preserve"> (Numpad +)</w:t>
+            <w:r>
+              <w:rPr>
+                <w:rFonts w:eastAsia="Times New Roman" w:cs="Times New Roman"/>
+                <w:color w:val="000000"/>
+                <w:kern w:val="0"/>
+                <w14:ligatures w14:val="none"/>
+              </w:rPr>
+              <w:t>Shift+Plus (Numpad +)</w:t>
             </w:r>
           </w:p>
         </w:tc>
@@ -5648,25 +5446,14 @@
                 <w14:ligatures w14:val="none"/>
               </w:rPr>
             </w:pPr>
-            <w:proofErr w:type="spellStart"/>
-            <w:r>
-              <w:rPr>
-                <w:rFonts w:eastAsia="Times New Roman" w:cs="Times New Roman"/>
-                <w:color w:val="000000"/>
-                <w:kern w:val="0"/>
-                <w14:ligatures w14:val="none"/>
-              </w:rPr>
-              <w:t>Shift+Minus</w:t>
-            </w:r>
-            <w:proofErr w:type="spellEnd"/>
-            <w:r>
-              <w:rPr>
-                <w:rFonts w:eastAsia="Times New Roman" w:cs="Times New Roman"/>
-                <w:color w:val="000000"/>
-                <w:kern w:val="0"/>
-                <w14:ligatures w14:val="none"/>
-              </w:rPr>
-              <w:t xml:space="preserve"> (Numpad -)</w:t>
+            <w:r>
+              <w:rPr>
+                <w:rFonts w:eastAsia="Times New Roman" w:cs="Times New Roman"/>
+                <w:color w:val="000000"/>
+                <w:kern w:val="0"/>
+                <w14:ligatures w14:val="none"/>
+              </w:rPr>
+              <w:t>Shift+Minus (Numpad -)</w:t>
             </w:r>
           </w:p>
         </w:tc>
@@ -5732,7 +5519,6 @@
                 <w14:ligatures w14:val="none"/>
               </w:rPr>
             </w:pPr>
-            <w:proofErr w:type="spellStart"/>
             <w:r>
               <w:rPr>
                 <w:rFonts w:eastAsia="Times New Roman" w:cs="Times New Roman"/>
@@ -5742,7 +5528,6 @@
               </w:rPr>
               <w:t>Shift+End</w:t>
             </w:r>
-            <w:proofErr w:type="spellEnd"/>
           </w:p>
         </w:tc>
         <w:tc>
@@ -7407,7 +7192,6 @@
                 <w14:ligatures w14:val="none"/>
               </w:rPr>
             </w:pPr>
-            <w:proofErr w:type="spellStart"/>
             <w:r>
               <w:rPr>
                 <w:rFonts w:eastAsia="Times New Roman" w:cs="Times New Roman"/>
@@ -7417,7 +7201,6 @@
               </w:rPr>
               <w:t>Shift+S</w:t>
             </w:r>
-            <w:proofErr w:type="spellEnd"/>
           </w:p>
         </w:tc>
         <w:tc>
@@ -7482,7 +7265,6 @@
                 <w14:ligatures w14:val="none"/>
               </w:rPr>
             </w:pPr>
-            <w:proofErr w:type="spellStart"/>
             <w:r>
               <w:rPr>
                 <w:rFonts w:eastAsia="Times New Roman" w:cs="Times New Roman"/>
@@ -7492,7 +7274,6 @@
               </w:rPr>
               <w:t>Shift+A</w:t>
             </w:r>
-            <w:proofErr w:type="spellEnd"/>
           </w:p>
         </w:tc>
         <w:tc>
@@ -7557,7 +7338,6 @@
                 <w14:ligatures w14:val="none"/>
               </w:rPr>
             </w:pPr>
-            <w:proofErr w:type="spellStart"/>
             <w:r>
               <w:rPr>
                 <w:rFonts w:eastAsia="Times New Roman" w:cs="Times New Roman"/>
@@ -7567,7 +7347,6 @@
               </w:rPr>
               <w:t>Shift+D</w:t>
             </w:r>
-            <w:proofErr w:type="spellEnd"/>
           </w:p>
         </w:tc>
         <w:tc>
@@ -7632,7 +7411,6 @@
                 <w14:ligatures w14:val="none"/>
               </w:rPr>
             </w:pPr>
-            <w:proofErr w:type="spellStart"/>
             <w:r>
               <w:rPr>
                 <w:rFonts w:eastAsia="Times New Roman" w:cs="Times New Roman"/>
@@ -7642,7 +7420,6 @@
               </w:rPr>
               <w:t>Shift+Q</w:t>
             </w:r>
-            <w:proofErr w:type="spellEnd"/>
           </w:p>
         </w:tc>
         <w:tc>
@@ -7707,7 +7484,6 @@
                 <w14:ligatures w14:val="none"/>
               </w:rPr>
             </w:pPr>
-            <w:proofErr w:type="spellStart"/>
             <w:r>
               <w:rPr>
                 <w:rFonts w:eastAsia="Times New Roman" w:cs="Times New Roman"/>
@@ -7717,7 +7493,6 @@
               </w:rPr>
               <w:t>Shift+E</w:t>
             </w:r>
-            <w:proofErr w:type="spellEnd"/>
           </w:p>
         </w:tc>
         <w:tc>
@@ -8971,25 +8746,14 @@
                 <w14:ligatures w14:val="none"/>
               </w:rPr>
             </w:pPr>
-            <w:proofErr w:type="spellStart"/>
-            <w:r>
-              <w:rPr>
-                <w:rFonts w:eastAsia="Times New Roman" w:cs="Times New Roman"/>
-                <w:color w:val="000000"/>
-                <w:kern w:val="0"/>
-                <w14:ligatures w14:val="none"/>
-              </w:rPr>
-              <w:t>Ctrl+Decimal</w:t>
-            </w:r>
-            <w:proofErr w:type="spellEnd"/>
-            <w:r>
-              <w:rPr>
-                <w:rFonts w:eastAsia="Times New Roman" w:cs="Times New Roman"/>
-                <w:color w:val="000000"/>
-                <w:kern w:val="0"/>
-                <w14:ligatures w14:val="none"/>
-              </w:rPr>
-              <w:t xml:space="preserve"> (Numpad .)</w:t>
+            <w:r>
+              <w:rPr>
+                <w:rFonts w:eastAsia="Times New Roman" w:cs="Times New Roman"/>
+                <w:color w:val="000000"/>
+                <w:kern w:val="0"/>
+                <w14:ligatures w14:val="none"/>
+              </w:rPr>
+              <w:t>Ctrl+Decimal (Numpad .)</w:t>
             </w:r>
           </w:p>
         </w:tc>
@@ -9055,25 +8819,14 @@
                 <w14:ligatures w14:val="none"/>
               </w:rPr>
             </w:pPr>
-            <w:proofErr w:type="spellStart"/>
-            <w:r>
-              <w:rPr>
-                <w:rFonts w:eastAsia="Times New Roman" w:cs="Times New Roman"/>
-                <w:color w:val="000000"/>
-                <w:kern w:val="0"/>
-                <w14:ligatures w14:val="none"/>
-              </w:rPr>
-              <w:t>Ctrl+Enter</w:t>
-            </w:r>
-            <w:proofErr w:type="spellEnd"/>
-            <w:r>
-              <w:rPr>
-                <w:rFonts w:eastAsia="Times New Roman" w:cs="Times New Roman"/>
-                <w:color w:val="000000"/>
-                <w:kern w:val="0"/>
-                <w14:ligatures w14:val="none"/>
-              </w:rPr>
-              <w:t xml:space="preserve"> (Numpad)</w:t>
+            <w:r>
+              <w:rPr>
+                <w:rFonts w:eastAsia="Times New Roman" w:cs="Times New Roman"/>
+                <w:color w:val="000000"/>
+                <w:kern w:val="0"/>
+                <w14:ligatures w14:val="none"/>
+              </w:rPr>
+              <w:t>Ctrl+Enter (Numpad)</w:t>
             </w:r>
           </w:p>
         </w:tc>
@@ -9139,25 +8892,14 @@
                 <w14:ligatures w14:val="none"/>
               </w:rPr>
             </w:pPr>
-            <w:proofErr w:type="spellStart"/>
-            <w:r>
-              <w:rPr>
-                <w:rFonts w:eastAsia="Times New Roman" w:cs="Times New Roman"/>
-                <w:color w:val="000000"/>
-                <w:kern w:val="0"/>
-                <w14:ligatures w14:val="none"/>
-              </w:rPr>
-              <w:t>Ctrl+Page</w:t>
-            </w:r>
-            <w:proofErr w:type="spellEnd"/>
-            <w:r>
-              <w:rPr>
-                <w:rFonts w:eastAsia="Times New Roman" w:cs="Times New Roman"/>
-                <w:color w:val="000000"/>
-                <w:kern w:val="0"/>
-                <w14:ligatures w14:val="none"/>
-              </w:rPr>
-              <w:t xml:space="preserve"> Up</w:t>
+            <w:r>
+              <w:rPr>
+                <w:rFonts w:eastAsia="Times New Roman" w:cs="Times New Roman"/>
+                <w:color w:val="000000"/>
+                <w:kern w:val="0"/>
+                <w14:ligatures w14:val="none"/>
+              </w:rPr>
+              <w:t>Ctrl+Page Up</w:t>
             </w:r>
           </w:p>
         </w:tc>
@@ -9223,25 +8965,14 @@
                 <w14:ligatures w14:val="none"/>
               </w:rPr>
             </w:pPr>
-            <w:proofErr w:type="spellStart"/>
-            <w:r>
-              <w:rPr>
-                <w:rFonts w:eastAsia="Times New Roman" w:cs="Times New Roman"/>
-                <w:color w:val="000000"/>
-                <w:kern w:val="0"/>
-                <w14:ligatures w14:val="none"/>
-              </w:rPr>
-              <w:t>Ctrl+Multiply</w:t>
-            </w:r>
-            <w:proofErr w:type="spellEnd"/>
-            <w:r>
-              <w:rPr>
-                <w:rFonts w:eastAsia="Times New Roman" w:cs="Times New Roman"/>
-                <w:color w:val="000000"/>
-                <w:kern w:val="0"/>
-                <w14:ligatures w14:val="none"/>
-              </w:rPr>
-              <w:t xml:space="preserve"> (Numpad *)</w:t>
+            <w:r>
+              <w:rPr>
+                <w:rFonts w:eastAsia="Times New Roman" w:cs="Times New Roman"/>
+                <w:color w:val="000000"/>
+                <w:kern w:val="0"/>
+                <w14:ligatures w14:val="none"/>
+              </w:rPr>
+              <w:t>Ctrl+Multiply (Numpad *)</w:t>
             </w:r>
           </w:p>
         </w:tc>
@@ -9307,25 +9038,14 @@
                 <w14:ligatures w14:val="none"/>
               </w:rPr>
             </w:pPr>
-            <w:proofErr w:type="spellStart"/>
-            <w:r>
-              <w:rPr>
-                <w:rFonts w:eastAsia="Times New Roman" w:cs="Times New Roman"/>
-                <w:color w:val="000000"/>
-                <w:kern w:val="0"/>
-                <w14:ligatures w14:val="none"/>
-              </w:rPr>
-              <w:t>Ctrl+Plus</w:t>
-            </w:r>
-            <w:proofErr w:type="spellEnd"/>
-            <w:r>
-              <w:rPr>
-                <w:rFonts w:eastAsia="Times New Roman" w:cs="Times New Roman"/>
-                <w:color w:val="000000"/>
-                <w:kern w:val="0"/>
-                <w14:ligatures w14:val="none"/>
-              </w:rPr>
-              <w:t xml:space="preserve"> (Numpad +)</w:t>
+            <w:r>
+              <w:rPr>
+                <w:rFonts w:eastAsia="Times New Roman" w:cs="Times New Roman"/>
+                <w:color w:val="000000"/>
+                <w:kern w:val="0"/>
+                <w14:ligatures w14:val="none"/>
+              </w:rPr>
+              <w:t>Ctrl+Plus (Numpad +)</w:t>
             </w:r>
           </w:p>
         </w:tc>
@@ -9391,25 +9111,14 @@
                 <w14:ligatures w14:val="none"/>
               </w:rPr>
             </w:pPr>
-            <w:proofErr w:type="spellStart"/>
-            <w:r>
-              <w:rPr>
-                <w:rFonts w:eastAsia="Times New Roman" w:cs="Times New Roman"/>
-                <w:color w:val="000000"/>
-                <w:kern w:val="0"/>
-                <w14:ligatures w14:val="none"/>
-              </w:rPr>
-              <w:t>Ctrl+Minus</w:t>
-            </w:r>
-            <w:proofErr w:type="spellEnd"/>
-            <w:r>
-              <w:rPr>
-                <w:rFonts w:eastAsia="Times New Roman" w:cs="Times New Roman"/>
-                <w:color w:val="000000"/>
-                <w:kern w:val="0"/>
-                <w14:ligatures w14:val="none"/>
-              </w:rPr>
-              <w:t xml:space="preserve"> (Numpad -)</w:t>
+            <w:r>
+              <w:rPr>
+                <w:rFonts w:eastAsia="Times New Roman" w:cs="Times New Roman"/>
+                <w:color w:val="000000"/>
+                <w:kern w:val="0"/>
+                <w14:ligatures w14:val="none"/>
+              </w:rPr>
+              <w:t>Ctrl+Minus (Numpad -)</w:t>
             </w:r>
           </w:p>
         </w:tc>
@@ -9868,7 +9577,6 @@
                 <w14:ligatures w14:val="none"/>
               </w:rPr>
             </w:pPr>
-            <w:proofErr w:type="spellStart"/>
             <w:r>
               <w:rPr>
                 <w:rFonts w:eastAsia="Times New Roman" w:cs="Times New Roman"/>
@@ -9878,7 +9586,6 @@
               </w:rPr>
               <w:t>Alt+W</w:t>
             </w:r>
-            <w:proofErr w:type="spellEnd"/>
           </w:p>
         </w:tc>
         <w:tc>
@@ -10016,7 +9723,6 @@
                 <w14:ligatures w14:val="none"/>
               </w:rPr>
             </w:pPr>
-            <w:proofErr w:type="spellStart"/>
             <w:r>
               <w:rPr>
                 <w:rFonts w:eastAsia="Times New Roman" w:cs="Times New Roman"/>
@@ -10026,7 +9732,6 @@
               </w:rPr>
               <w:t>Alt+S</w:t>
             </w:r>
-            <w:proofErr w:type="spellEnd"/>
           </w:p>
         </w:tc>
         <w:tc>
@@ -10445,25 +10150,14 @@
                 <w14:ligatures w14:val="none"/>
               </w:rPr>
             </w:pPr>
-            <w:proofErr w:type="gramStart"/>
-            <w:r>
-              <w:rPr>
-                <w:rFonts w:eastAsia="Times New Roman" w:cs="Times New Roman"/>
-                <w:color w:val="000000"/>
-                <w:kern w:val="0"/>
-                <w14:ligatures w14:val="none"/>
-              </w:rPr>
-              <w:t>Increase</w:t>
-            </w:r>
-            <w:proofErr w:type="gramEnd"/>
-            <w:r>
-              <w:rPr>
-                <w:rFonts w:eastAsia="Times New Roman" w:cs="Times New Roman"/>
-                <w:color w:val="000000"/>
-                <w:kern w:val="0"/>
-                <w14:ligatures w14:val="none"/>
-              </w:rPr>
-              <w:t xml:space="preserve"> Descent Rate</w:t>
+            <w:r>
+              <w:rPr>
+                <w:rFonts w:eastAsia="Times New Roman" w:cs="Times New Roman"/>
+                <w:color w:val="000000"/>
+                <w:kern w:val="0"/>
+                <w14:ligatures w14:val="none"/>
+              </w:rPr>
+              <w:t>Increase Descent Rate</w:t>
             </w:r>
           </w:p>
         </w:tc>
@@ -11022,25 +10716,14 @@
                 <w14:ligatures w14:val="none"/>
               </w:rPr>
             </w:pPr>
-            <w:proofErr w:type="gramStart"/>
-            <w:r>
-              <w:rPr>
-                <w:rFonts w:eastAsia="Times New Roman" w:cs="Times New Roman"/>
-                <w:color w:val="000000"/>
-                <w:kern w:val="0"/>
-                <w14:ligatures w14:val="none"/>
-              </w:rPr>
-              <w:t>Abort</w:t>
-            </w:r>
-            <w:proofErr w:type="gramEnd"/>
-            <w:r>
-              <w:rPr>
-                <w:rFonts w:eastAsia="Times New Roman" w:cs="Times New Roman"/>
-                <w:color w:val="000000"/>
-                <w:kern w:val="0"/>
-                <w14:ligatures w14:val="none"/>
-              </w:rPr>
-              <w:t xml:space="preserve"> Stage PUSH</w:t>
+            <w:r>
+              <w:rPr>
+                <w:rFonts w:eastAsia="Times New Roman" w:cs="Times New Roman"/>
+                <w:color w:val="000000"/>
+                <w:kern w:val="0"/>
+                <w14:ligatures w14:val="none"/>
+              </w:rPr>
+              <w:t>Abort Stage PUSH</w:t>
             </w:r>
           </w:p>
         </w:tc>
@@ -11363,7 +11046,6 @@
                 <w14:ligatures w14:val="none"/>
               </w:rPr>
             </w:pPr>
-            <w:proofErr w:type="spellStart"/>
             <w:r>
               <w:rPr>
                 <w:rFonts w:eastAsia="Times New Roman" w:cs="Times New Roman"/>
@@ -11373,7 +11055,6 @@
               </w:rPr>
               <w:t>Ctrl+Alt+Numpad</w:t>
             </w:r>
-            <w:proofErr w:type="spellEnd"/>
           </w:p>
         </w:tc>
         <w:tc>
@@ -13276,7 +12957,7 @@
       <w:pPr>
         <w:pStyle w:val="Heading1"/>
       </w:pPr>
-      <w:bookmarkStart w:id="5" w:name="_Toc241405949"/>
+      <w:bookmarkStart w:id="5" w:name="_Toc242456626"/>
       <w:r>
         <w:lastRenderedPageBreak/>
         <w:t>Important Links:</w:t>
@@ -14425,6 +14106,7 @@
   <w:style w:type="character" w:default="1" w:styleId="DefaultParagraphFont">
     <w:name w:val="Default Paragraph Font"/>
     <w:uiPriority w:val="1"/>
+    <w:semiHidden/>
     <w:unhideWhenUsed/>
   </w:style>
   <w:style w:type="table" w:default="1" w:styleId="TableNormal">

</xml_diff>